<commit_message>
Switch car sign to landscape layout
Co-Authored-By: Claude Sonnet 5.5 <noreply@anthropic.com>
Claude-Session: https://claude.ai/code/session_01SCzRgLVaCc87y2tN3zA1pW
</commit_message>
<xml_diff>
--- a/car-sign/No-Food-No-Drink-Sign.docx
+++ b/car-sign/No-Food-No-Drink-Sign.docx
@@ -4,7 +4,7 @@
   <w:body>
     <w:p>
       <w:pPr>
-        <w:spacing w:after="0"/>
+        <w:spacing w:after="0" w:before="1700"/>
         <w:jc w:val="center"/>
       </w:pPr>
       <w:r>
@@ -13,15 +13,15 @@
           <w:b/>
           <w:bCs/>
           <w:color w:val="C00000"/>
-          <w:sz w:val="260"/>
-          <w:szCs w:val="260"/>
-        </w:rPr>
-        <w:t xml:space="preserve">NO</w:t>
-      </w:r>
-    </w:p>
-    <w:p>
-      <w:pPr>
-        <w:spacing w:after="0"/>
+          <w:sz w:val="220"/>
+          <w:szCs w:val="220"/>
+        </w:rPr>
+        <w:t xml:space="preserve">NO FOOD</w:t>
+      </w:r>
+    </w:p>
+    <w:p>
+      <w:pPr>
+        <w:spacing w:after="200" w:before="0"/>
         <w:jc w:val="center"/>
       </w:pPr>
       <w:r>
@@ -30,49 +30,15 @@
           <w:b/>
           <w:bCs/>
           <w:color w:val="C00000"/>
-          <w:sz w:val="260"/>
-          <w:szCs w:val="260"/>
-        </w:rPr>
-        <w:t xml:space="preserve">FOOD</w:t>
-      </w:r>
-    </w:p>
-    <w:p>
-      <w:pPr>
-        <w:spacing w:after="0"/>
-        <w:jc w:val="center"/>
-      </w:pPr>
-      <w:r>
-        <w:rPr>
-          <w:rFonts w:ascii="Arial" w:cs="Arial" w:eastAsia="Arial" w:hAnsi="Arial"/>
-          <w:b/>
-          <w:bCs/>
-          <w:color w:val="C00000"/>
-          <w:sz w:val="260"/>
-          <w:szCs w:val="260"/>
-        </w:rPr>
-        <w:t xml:space="preserve">NO</w:t>
-      </w:r>
-    </w:p>
-    <w:p>
-      <w:pPr>
-        <w:spacing w:after="300"/>
-        <w:jc w:val="center"/>
-      </w:pPr>
-      <w:r>
-        <w:rPr>
-          <w:rFonts w:ascii="Arial" w:cs="Arial" w:eastAsia="Arial" w:hAnsi="Arial"/>
-          <w:b/>
-          <w:bCs/>
-          <w:color w:val="C00000"/>
-          <w:sz w:val="260"/>
-          <w:szCs w:val="260"/>
-        </w:rPr>
-        <w:t xml:space="preserve">DRINK</w:t>
-      </w:r>
-    </w:p>
-    <w:p>
-      <w:pPr>
-        <w:spacing w:after="0"/>
+          <w:sz w:val="220"/>
+          <w:szCs w:val="220"/>
+        </w:rPr>
+        <w:t xml:space="preserve">NO DRINK</w:t>
+      </w:r>
+    </w:p>
+    <w:p>
+      <w:pPr>
+        <w:spacing w:after="0" w:before="0"/>
         <w:jc w:val="center"/>
       </w:pPr>
       <w:r>
@@ -81,15 +47,15 @@
           <w:b/>
           <w:bCs/>
           <w:color w:val="000000"/>
-          <w:sz w:val="120"/>
-          <w:szCs w:val="120"/>
+          <w:sz w:val="110"/>
+          <w:szCs w:val="110"/>
         </w:rPr>
         <w:t xml:space="preserve">IN THE CAR</w:t>
       </w:r>
     </w:p>
     <w:sectPr>
-      <w:pgSz w:w="12240" w:h="15840" w:orient="portrait"/>
-      <w:pgMar w:top="1080" w:right="1080" w:bottom="1080" w:left="1080" w:header="708" w:footer="708" w:gutter="0"/>
+      <w:pgSz w:w="15840" w:h="12240" w:orient="landscape"/>
+      <w:pgMar w:top="900" w:right="900" w:bottom="900" w:left="900" w:header="708" w:footer="708" w:gutter="0"/>
       <w:pgNumType/>
       <w:docGrid w:linePitch="360"/>
     </w:sectPr>

</xml_diff>

<commit_message>
Add thank-you line to car sign
Co-Authored-By: Claude Sonnet 5.5 <noreply@anthropic.com>
Claude-Session: https://claude.ai/code/session_01SCzRgLVaCc87y2tN3zA1pW
</commit_message>
<xml_diff>
--- a/car-sign/No-Food-No-Drink-Sign.docx
+++ b/car-sign/No-Food-No-Drink-Sign.docx
@@ -4,7 +4,7 @@
   <w:body>
     <w:p>
       <w:pPr>
-        <w:spacing w:after="0" w:before="1700"/>
+        <w:spacing w:after="0" w:before="700"/>
         <w:jc w:val="center"/>
       </w:pPr>
       <w:r>
@@ -38,7 +38,7 @@
     </w:p>
     <w:p>
       <w:pPr>
-        <w:spacing w:after="0" w:before="0"/>
+        <w:spacing w:after="300" w:before="0"/>
         <w:jc w:val="center"/>
       </w:pPr>
       <w:r>
@@ -51,6 +51,23 @@
           <w:szCs w:val="110"/>
         </w:rPr>
         <w:t xml:space="preserve">IN THE CAR</w:t>
+      </w:r>
+    </w:p>
+    <w:p>
+      <w:pPr>
+        <w:spacing w:after="0" w:before="0"/>
+        <w:jc w:val="center"/>
+      </w:pPr>
+      <w:r>
+        <w:rPr>
+          <w:rFonts w:ascii="Arial" w:cs="Arial" w:eastAsia="Arial" w:hAnsi="Arial"/>
+          <w:b w:val="false"/>
+          <w:bCs w:val="false"/>
+          <w:color w:val="404040"/>
+          <w:sz w:val="60"/>
+          <w:szCs w:val="60"/>
+        </w:rPr>
+        <w:t xml:space="preserve">Thank you for keeping the car clean!</w:t>
       </w:r>
     </w:p>
     <w:sectPr>

</xml_diff>